<commit_message>
Add end-to-end architecture diagram
</commit_message>
<xml_diff>
--- a/docs/agentic-devops-full-article.docx
+++ b/docs/agentic-devops-full-article.docx
@@ -2325,6 +2325,11 @@
       </w:r>
     </w:p>
     <w:p>
+      <w:r>
+        <w:br w:type="page"/>
+      </w:r>
+    </w:p>
+    <w:p>
       <w:pPr>
         <w:pStyle w:val="Heading2"/>
       </w:pPr>
@@ -2339,66 +2344,52 @@
     </w:p>
     <w:p>
       <w:pPr>
-        <w:keepNext/>
+        <w:jc w:val="center"/>
       </w:pPr>
       <w:r>
         <w:rPr>
           <w:b/>
         </w:rPr>
-        <w:t>Mermaid diagram source</w:t>
-      </w:r>
-    </w:p>
-    <w:p>
-      <w:pPr>
-        <w:shd w:fill="F3F4F6"/>
-        <w:spacing w:after="160"/>
-        <w:ind w:left="216" w:right="216"/>
-      </w:pPr>
-      <w:r>
-        <w:rPr>
-          <w:rFonts w:ascii="Consolas" w:hAnsi="Consolas"/>
-          <w:sz w:val="18"/>
-        </w:rPr>
-        <w:t>flowchart LR</w:t>
-        <w:br/>
-        <w:t xml:space="preserve">    developer["Developer"]</w:t>
-        <w:br/>
-        <w:t xml:space="preserve">    repo["GitHub Repository"]</w:t>
-        <w:br/>
-        <w:t xml:space="preserve">    workflow["GitHub Actions Workflow"]</w:t>
-        <w:br/>
-        <w:t xml:space="preserve">    build["Build and Test"]</w:t>
-        <w:br/>
-        <w:t xml:space="preserve">    evidence["Release Evidence"]</w:t>
-        <w:br/>
-        <w:t xml:space="preserve">    review["Agentic Release Review"]</w:t>
-        <w:br/>
-        <w:t xml:space="preserve">    foundry["Microsoft Foundry Agent"]</w:t>
-        <w:br/>
-        <w:t xml:space="preserve">    staging["Staging Environment"]</w:t>
-        <w:br/>
-        <w:t xml:space="preserve">    approval["Human Approval Gate"]</w:t>
-        <w:br/>
-        <w:t xml:space="preserve">    production["Production Environment"]</w:t>
-        <w:br/>
-        <w:br/>
-        <w:t xml:space="preserve">    developer --&gt; repo</w:t>
-        <w:br/>
-        <w:t xml:space="preserve">    repo --&gt; workflow</w:t>
-        <w:br/>
-        <w:t xml:space="preserve">    workflow --&gt; build</w:t>
-        <w:br/>
-        <w:t xml:space="preserve">    build --&gt; evidence</w:t>
-        <w:br/>
-        <w:t xml:space="preserve">    evidence --&gt; review</w:t>
-        <w:br/>
-        <w:t xml:space="preserve">    foundry -. "Reviews same evidence" .-&gt; review</w:t>
-        <w:br/>
-        <w:t xml:space="preserve">    review --&gt; staging</w:t>
-        <w:br/>
-        <w:t xml:space="preserve">    staging --&gt; approval</w:t>
-        <w:br/>
-        <w:t xml:space="preserve">    approval --&gt; production</w:t>
+        <w:t>Architecture Figure: End-to-End Agentic DevOps architecture flow.</w:t>
+      </w:r>
+    </w:p>
+    <w:p>
+      <w:pPr>
+        <w:jc w:val="center"/>
+      </w:pPr>
+      <w:r>
+        <w:drawing>
+          <wp:inline xmlns:a="http://schemas.openxmlformats.org/drawingml/2006/main" xmlns:pic="http://schemas.openxmlformats.org/drawingml/2006/picture">
+            <wp:extent cx="5806440" cy="3387090"/>
+            <wp:docPr id="26" name="Picture 26"/>
+            <wp:cNvGraphicFramePr>
+              <a:graphicFrameLocks noChangeAspect="1"/>
+            </wp:cNvGraphicFramePr>
+            <a:graphic>
+              <a:graphicData uri="http://schemas.openxmlformats.org/drawingml/2006/picture">
+                <pic:pic>
+                  <pic:nvPicPr>
+                    <pic:cNvPr id="0" name="agentic-devops-end-to-end-architecture.png"/>
+                    <pic:cNvPicPr/>
+                  </pic:nvPicPr>
+                  <pic:blipFill>
+                    <a:blip r:embed="rId42"/>
+                    <a:stretch>
+                      <a:fillRect/>
+                    </a:stretch>
+                  </pic:blipFill>
+                  <pic:spPr>
+                    <a:xfrm>
+                      <a:off x="0" y="0"/>
+                      <a:ext cx="5806440" cy="3387090"/>
+                    </a:xfrm>
+                    <a:prstGeom prst="rect"/>
+                  </pic:spPr>
+                </pic:pic>
+              </a:graphicData>
+            </a:graphic>
+          </wp:inline>
+        </w:drawing>
       </w:r>
     </w:p>
     <w:p>
@@ -6623,17 +6614,6 @@
     <w:p>
       <w:r>
         <w:t>This is important because scaling Agentic DevOps is not only about running one successful pipeline. It is about making the same governed pattern repeatable for many teams.</w:t>
-      </w:r>
-    </w:p>
-    <w:p>
-      <w:pPr>
-        <w:keepNext/>
-      </w:pPr>
-      <w:r>
-        <w:rPr>
-          <w:b/>
-        </w:rPr>
-        <w:t>Mermaid diagram source</w:t>
       </w:r>
     </w:p>
     <w:p>

</xml_diff>